<commit_message>
Align final report and QA pack with S2 fuel_displacement headline
</commit_message>
<xml_diff>
--- a/reports/final/UCL_Group3_Final_Report_Draft_v2.docx
+++ b/reports/final/UCL_Group3_Final_Report_Draft_v2.docx
@@ -47,7 +47,7 @@
       </w:r>
     </w:p>
     <w:bookmarkEnd w:id="10"/>
-    <w:bookmarkStart w:id="11" w:name="introduction-and-project-overview"/>
+    <w:bookmarkStart w:id="11" w:name="Xc281140ea84824c0a5a74b1a677e2170ecd04a6"/>
     <w:p>
       <w:pPr>
         <w:pStyle w:val="Heading2"/>
@@ -78,10 +78,10 @@
         <w:rPr>
           <w:rStyle w:val="VerbatimChar"/>
         </w:rPr>
-        <w:t xml:space="preserve">S0_BASE_30MW_OPONLY</w:t>
-      </w:r>
-      <w:r>
-        <w:t xml:space="preserve">: a 30.0 MWth reactor basis, fixed-boundary dry-cooling assumptions at 40C ambient, and an operational-only carbon boundary. In this locked case, the plant is feasible and converged, produces 9.939 MWe net electrical output, and achieves 44,468 tCO2/year net reduction with a primary FoM of 1482.3 tCO2/MWth/year.</w:t>
+        <w:t xml:space="preserve">S2_30MW_FUELDISP</w:t>
+      </w:r>
+      <w:r>
+        <w:t xml:space="preserve">: a 30.0 MWth reactor basis, fixed-boundary dry-cooling assumptions at 40C ambient, and a fuel-displacement carbon boundary. In this locked case, the plant is feasible and converged, produces 9.939 MWe net electrical output, and achieves 9,898 tCO2/year net reduction with a primary FoM of 329.9 tCO2/MWth/year.</w:t>
       </w:r>
     </w:p>
     <w:p>
@@ -101,7 +101,7 @@
       </w:r>
     </w:p>
     <w:bookmarkEnd w:id="11"/>
-    <w:bookmarkStart w:id="16" w:name="concept-overview-and-down-selection"/>
+    <w:bookmarkStart w:id="16" w:name="Xa19888cf49e68b944a99b1ee0ecb111ac047e1e"/>
     <w:p>
       <w:pPr>
         <w:pStyle w:val="Heading2"/>
@@ -110,7 +110,7 @@
         <w:t xml:space="preserve">2. Concept Overview and Down-Selection</w:t>
       </w:r>
     </w:p>
-    <w:bookmarkStart w:id="12" w:name="design-constraint-and-starting-point"/>
+    <w:bookmarkStart w:id="12" w:name="Xa8942258827dfbd428cd351dc9cf1474d145555"/>
     <w:p>
       <w:pPr>
         <w:pStyle w:val="Heading3"/>
@@ -128,7 +128,7 @@
       </w:r>
     </w:p>
     <w:bookmarkEnd w:id="12"/>
-    <w:bookmarkStart w:id="13" w:name="application-selection-pugh-matrix"/>
+    <w:bookmarkStart w:id="13" w:name="X8bc28459c10c5263aa3724f468f89c92e235d1e"/>
     <w:p>
       <w:pPr>
         <w:pStyle w:val="Heading3"/>
@@ -533,7 +533,7 @@
       </w:r>
     </w:p>
     <w:bookmarkEnd w:id="13"/>
-    <w:bookmarkStart w:id="14" w:name="carbon-capture-selection-pugh-matrix"/>
+    <w:bookmarkStart w:id="14" w:name="Xf118cb2181f13edf601d98d542ed2f659532c69"/>
     <w:p>
       <w:pPr>
         <w:pStyle w:val="Heading3"/>
@@ -808,7 +808,7 @@
       </w:tr>
     </w:tbl>
     <w:bookmarkEnd w:id="14"/>
-    <w:bookmarkStart w:id="15" w:name="power-conversion-selection"/>
+    <w:bookmarkStart w:id="15" w:name="X86f07211f7b83a8e3e32ae1221082a6daad3b69"/>
     <w:p>
       <w:pPr>
         <w:pStyle w:val="Heading3"/>
@@ -1092,7 +1092,7 @@
     </w:p>
     <w:bookmarkEnd w:id="15"/>
     <w:bookmarkEnd w:id="16"/>
-    <w:bookmarkStart w:id="17" w:name="integrated-system-architecture"/>
+    <w:bookmarkStart w:id="17" w:name="Xe6c8a4892aba54394fb9398e5d58f2b4e4dc151"/>
     <w:p>
       <w:pPr>
         <w:pStyle w:val="Heading2"/>
@@ -1162,7 +1162,7 @@
       </w:r>
     </w:p>
     <w:bookmarkEnd w:id="17"/>
-    <w:bookmarkStart w:id="22" w:name="modelling-development-and-methodology"/>
+    <w:bookmarkStart w:id="22" w:name="X2b0d56d8dd7773ab96c973364d998928f2062d1"/>
     <w:p>
       <w:pPr>
         <w:pStyle w:val="Heading2"/>
@@ -1171,7 +1171,7 @@
         <w:t xml:space="preserve">4. Modelling Development and Methodology</w:t>
       </w:r>
     </w:p>
-    <w:bookmarkStart w:id="18" w:name="modelling-philosophy-and-fidelity"/>
+    <w:bookmarkStart w:id="18" w:name="Xa239cf1ec9c59d5597cf541f0ed5b8e718bf5b0"/>
     <w:p>
       <w:pPr>
         <w:pStyle w:val="Heading3"/>
@@ -1197,7 +1197,7 @@
       </w:r>
     </w:p>
     <w:bookmarkEnd w:id="18"/>
-    <w:bookmarkStart w:id="19" w:name="sco2-plant-solver"/>
+    <w:bookmarkStart w:id="19" w:name="X0a9a6938311ddb19efcb6c49af495719cdd714d"/>
     <w:p>
       <w:pPr>
         <w:pStyle w:val="Heading3"/>
@@ -1212,329 +1212,6 @@
       </w:pPr>
       <w:r>
         <w:t xml:space="preserve">The plant solution is built around iterative coupling of cycle, IHX, and cooling boundary assumptions with embedded feasibility checks. Recent implementation includes:</w:t>
-      </w:r>
-      <w:r>
-        <w:t xml:space="preserve"> </w:t>
-      </w:r>
-      <w:r>
-        <w:t xml:space="preserve">- deterministic operating-point seed search in bounded</w:t>
-      </w:r>
-      <w:r>
-        <w:t xml:space="preserve"> </w:t>
-      </w:r>
-      <w:r>
-        <w:rPr>
-          <w:rStyle w:val="VerbatimChar"/>
-        </w:rPr>
-        <w:t xml:space="preserve">(P_high, P_low, f_recomp)</w:t>
-      </w:r>
-      <w:r>
-        <w:t xml:space="preserve"> </w:t>
-      </w:r>
-      <w:r>
-        <w:t xml:space="preserve">space,</w:t>
-      </w:r>
-      <w:r>
-        <w:t xml:space="preserve"> </w:t>
-      </w:r>
-      <w:r>
-        <w:t xml:space="preserve">- moderate bounded tuning sequence for infeasible starts,</w:t>
-      </w:r>
-      <w:r>
-        <w:t xml:space="preserve"> </w:t>
-      </w:r>
-      <w:r>
-        <w:t xml:space="preserve">- convergence-reason tracing and per-iteration diagnostics,</w:t>
-      </w:r>
-      <w:r>
-        <w:t xml:space="preserve"> </w:t>
-      </w:r>
-      <w:r>
-        <w:t xml:space="preserve">- canonical fail-fast gating when required-feasible conditions are violated.</w:t>
-      </w:r>
-    </w:p>
-    <w:p>
-      <w:pPr>
-        <w:pStyle w:val="BodyText"/>
-      </w:pPr>
-      <w:r>
-        <w:t xml:space="preserve">Segmented heat-exchanger treatment and pinch constraints are retained. Feasibility constraints are evaluated within the solve loop, not as post-hoc filtering.</w:t>
-      </w:r>
-    </w:p>
-    <w:p>
-      <w:pPr>
-        <w:pStyle w:val="BodyText"/>
-      </w:pPr>
-      <w:r>
-        <w:t xml:space="preserve">Efficiency definitions used in this report:</w:t>
-      </w:r>
-      <w:r>
-        <w:t xml:space="preserve"> </w:t>
-      </w:r>
-      <w:r>
-        <w:t xml:space="preserve">- Thermal efficiency (</w:t>
-      </w:r>
-      <w:r>
-        <w:rPr>
-          <w:rStyle w:val="VerbatimChar"/>
-        </w:rPr>
-        <w:t xml:space="preserve">eta_thermal</w:t>
-      </w:r>
-      <w:r>
-        <w:t xml:space="preserve">): cycle gross electrical power over cycle heat input basis (</w:t>
-      </w:r>
-      <w:r>
-        <w:rPr>
-          <w:rStyle w:val="VerbatimChar"/>
-        </w:rPr>
-        <w:t xml:space="preserve">Q_in</w:t>
-      </w:r>
-      <w:r>
-        <w:t xml:space="preserve"> </w:t>
-      </w:r>
-      <w:r>
-        <w:t xml:space="preserve">internal to cycle model).</w:t>
-      </w:r>
-      <w:r>
-        <w:t xml:space="preserve"> </w:t>
-      </w:r>
-      <w:r>
-        <w:t xml:space="preserve">- Net efficiency (</w:t>
-      </w:r>
-      <w:r>
-        <w:rPr>
-          <w:rStyle w:val="VerbatimChar"/>
-        </w:rPr>
-        <w:t xml:space="preserve">eta_net</w:t>
-      </w:r>
-      <w:r>
-        <w:t xml:space="preserve">): plant net electrical power over reactor thermal basis (</w:t>
-      </w:r>
-      <w:r>
-        <w:rPr>
-          <w:rStyle w:val="VerbatimChar"/>
-        </w:rPr>
-        <w:t xml:space="preserve">Q_thermal</w:t>
-      </w:r>
-      <w:r>
-        <w:t xml:space="preserve">).</w:t>
-      </w:r>
-    </w:p>
-    <w:bookmarkEnd w:id="19"/>
-    <w:bookmarkStart w:id="21" w:name="co2-accounting-method"/>
-    <w:p>
-      <w:pPr>
-        <w:pStyle w:val="Heading3"/>
-      </w:pPr>
-      <w:r>
-        <w:t xml:space="preserve">4.3 CO2 Accounting Method</w:t>
-      </w:r>
-    </w:p>
-    <w:bookmarkStart w:id="20" w:name="boundary-definition-box"/>
-    <w:p>
-      <w:pPr>
-        <w:pStyle w:val="Heading4"/>
-      </w:pPr>
-      <w:r>
-        <w:t xml:space="preserve">Boundary Definition Box</w:t>
-      </w:r>
-    </w:p>
-    <w:p>
-      <w:pPr>
-        <w:pStyle w:val="FirstParagraph"/>
-      </w:pPr>
-      <w:r>
-        <w:t xml:space="preserve">Headline boundary (used in main text):</w:t>
-      </w:r>
-    </w:p>
-    <w:p>
-      <w:pPr>
-        <w:pStyle w:val="BodyText"/>
-      </w:pPr>
-      <w:r>
-        <w:rPr>
-          <w:rStyle w:val="VerbatimChar"/>
-        </w:rPr>
-        <w:t xml:space="preserve">operational_only: CO2_net = CO2_DAC + CO2_grid</w:t>
-      </w:r>
-    </w:p>
-    <w:p>
-      <w:pPr>
-        <w:pStyle w:val="BodyText"/>
-      </w:pPr>
-      <w:r>
-        <w:t xml:space="preserve">Sensitivity boundary (reported separately):</w:t>
-      </w:r>
-    </w:p>
-    <w:p>
-      <w:pPr>
-        <w:pStyle w:val="BodyText"/>
-      </w:pPr>
-      <w:r>
-        <w:rPr>
-          <w:rStyle w:val="VerbatimChar"/>
-        </w:rPr>
-        <w:t xml:space="preserve">fuel_displacement: CO2_net = CO2_displaced_fossil + CO2_grid - CO2_embodied - CO2_reemitted_synthetic (if neutrality disabled)</w:t>
-      </w:r>
-    </w:p>
-    <w:p>
-      <w:pPr>
-        <w:pStyle w:val="BodyText"/>
-      </w:pPr>
-      <w:r>
-        <w:t xml:space="preserve">In the headline case, grid export is disabled, so operational-only net reduction is driven by DAC capture under the solved allocation constraints.</w:t>
-      </w:r>
-    </w:p>
-    <w:p>
-      <w:pPr>
-        <w:pStyle w:val="BodyText"/>
-      </w:pPr>
-      <w:r>
-        <w:t xml:space="preserve">Historical Jet-A equivalence assumptions are retained only for sensitivity framing and are not used to define the main headline FoM in this final draft.</w:t>
-      </w:r>
-    </w:p>
-    <w:bookmarkEnd w:id="20"/>
-    <w:bookmarkEnd w:id="21"/>
-    <w:bookmarkEnd w:id="22"/>
-    <w:bookmarkStart w:id="27" w:name="verification-and-validation"/>
-    <w:p>
-      <w:pPr>
-        <w:pStyle w:val="Heading2"/>
-      </w:pPr>
-      <w:r>
-        <w:t xml:space="preserve">5. Verification and Validation</w:t>
-      </w:r>
-    </w:p>
-    <w:bookmarkStart w:id="23" w:name="verification-implementation-correctness"/>
-    <w:p>
-      <w:pPr>
-        <w:pStyle w:val="Heading3"/>
-      </w:pPr>
-      <w:r>
-        <w:t xml:space="preserve">5.1 Verification (Implementation Correctness)</w:t>
-      </w:r>
-    </w:p>
-    <w:p>
-      <w:pPr>
-        <w:pStyle w:val="FirstParagraph"/>
-      </w:pPr>
-      <w:r>
-        <w:t xml:space="preserve">Verification evidence includes:</w:t>
-      </w:r>
-      <w:r>
-        <w:t xml:space="preserve"> </w:t>
-      </w:r>
-      <w:r>
-        <w:t xml:space="preserve">- unit-level and integration-level checks for new feasibility-recovery logic,</w:t>
-      </w:r>
-      <w:r>
-        <w:t xml:space="preserve"> </w:t>
-      </w:r>
-      <w:r>
-        <w:t xml:space="preserve">- deterministic search behavior tests,</w:t>
-      </w:r>
-      <w:r>
-        <w:t xml:space="preserve"> </w:t>
-      </w:r>
-      <w:r>
-        <w:t xml:space="preserve">- fail-fast/override control-flow tests,</w:t>
-      </w:r>
-      <w:r>
-        <w:t xml:space="preserve"> </w:t>
-      </w:r>
-      <w:r>
-        <w:t xml:space="preserve">- range-guard and metadata persistence checks,</w:t>
-      </w:r>
-      <w:r>
-        <w:t xml:space="preserve"> </w:t>
-      </w:r>
-      <w:r>
-        <w:t xml:space="preserve">- consistency checks for generated diagnostics serialization.</w:t>
-      </w:r>
-    </w:p>
-    <w:bookmarkEnd w:id="23"/>
-    <w:bookmarkStart w:id="24" w:name="validation-model-to-reference"/>
-    <w:p>
-      <w:pPr>
-        <w:pStyle w:val="Heading3"/>
-      </w:pPr>
-      <w:r>
-        <w:t xml:space="preserve">5.2 Validation (Model-to-Reference)</w:t>
-      </w:r>
-    </w:p>
-    <w:p>
-      <w:pPr>
-        <w:pStyle w:val="FirstParagraph"/>
-      </w:pPr>
-      <w:r>
-        <w:t xml:space="preserve">The cycle validation anchor is the Dostal-style case in the committed runner. Recent authoritative run output reports 41.07% thermal efficiency against an expected 45.0% ± 5.0% acceptance band, and this gate passes.</w:t>
-      </w:r>
-    </w:p>
-    <w:bookmarkEnd w:id="24"/>
-    <w:bookmarkStart w:id="25" w:name="feasibility-and-closure-evidence"/>
-    <w:p>
-      <w:pPr>
-        <w:pStyle w:val="Heading3"/>
-      </w:pPr>
-      <w:r>
-        <w:t xml:space="preserve">5.3 Feasibility and Closure Evidence</w:t>
-      </w:r>
-    </w:p>
-    <w:p>
-      <w:pPr>
-        <w:pStyle w:val="FirstParagraph"/>
-      </w:pPr>
-      <w:r>
-        <w:t xml:space="preserve">For the headline baseline (</w:t>
-      </w:r>
-      <w:r>
-        <w:rPr>
-          <w:rStyle w:val="VerbatimChar"/>
-        </w:rPr>
-        <w:t xml:space="preserve">S0_BASE_30MW_OPONLY</w:t>
-      </w:r>
-      <w:r>
-        <w:t xml:space="preserve">), all major gates pass:</w:t>
-      </w:r>
-      <w:r>
-        <w:t xml:space="preserve"> </w:t>
-      </w:r>
-      <w:r>
-        <w:t xml:space="preserve">- converged: true,</w:t>
-      </w:r>
-      <w:r>
-        <w:t xml:space="preserve"> </w:t>
-      </w:r>
-      <w:r>
-        <w:t xml:space="preserve">- feasible: true,</w:t>
-      </w:r>
-      <w:r>
-        <w:t xml:space="preserve"> </w:t>
-      </w:r>
-      <w:r>
-        <w:t xml:space="preserve">- plant energy closure: 0.435% (&lt;0.5% tolerance),</w:t>
-      </w:r>
-      <w:r>
-        <w:t xml:space="preserve"> </w:t>
-      </w:r>
-      <w:r>
-        <w:t xml:space="preserve">- positive pinch/supercritical margins,</w:t>
-      </w:r>
-      <w:r>
-        <w:t xml:space="preserve"> </w:t>
-      </w:r>
-      <w:r>
-        <w:t xml:space="preserve">- canonical scenarios S0-S3 all feasible and converged in final run.</w:t>
-      </w:r>
-    </w:p>
-    <w:bookmarkEnd w:id="25"/>
-    <w:bookmarkStart w:id="26" w:name="limitations"/>
-    <w:p>
-      <w:pPr>
-        <w:pStyle w:val="Heading3"/>
-      </w:pPr>
-      <w:r>
-        <w:t xml:space="preserve">5.4 Limitations</w:t>
       </w:r>
     </w:p>
     <w:p>
@@ -1546,7 +1223,22 @@
         </w:numPr>
       </w:pPr>
       <w:r>
-        <w:t xml:space="preserve">Headline mode uses fixed-boundary cooling assumptions; fully coupled-cooler mode is retained as sensitivity and is currently infeasible in the tested baseline ambient condition.</w:t>
+        <w:t xml:space="preserve">deterministic operating-point seed search in bounded</w:t>
+      </w:r>
+      <w:r>
+        <w:t xml:space="preserve"> </w:t>
+      </w:r>
+      <w:r>
+        <w:rPr>
+          <w:rStyle w:val="VerbatimChar"/>
+        </w:rPr>
+        <w:t xml:space="preserve">(P_high, P_low, f_recomp)</w:t>
+      </w:r>
+      <w:r>
+        <w:t xml:space="preserve"> </w:t>
+      </w:r>
+      <w:r>
+        <w:t xml:space="preserve">space,</w:t>
       </w:r>
     </w:p>
     <w:p>
@@ -1558,7 +1250,7 @@
         </w:numPr>
       </w:pPr>
       <w:r>
-        <w:t xml:space="preserve">Core transient safety results in Section 7 are literature/external-workstream tagged where not branch-reproduced.</w:t>
+        <w:t xml:space="preserve">moderate bounded tuning sequence for infeasible starts,</w:t>
       </w:r>
     </w:p>
     <w:p>
@@ -1570,36 +1262,440 @@
         </w:numPr>
       </w:pPr>
       <w:r>
-        <w:t xml:space="preserve">Uncertainty characterization uses the committed UQ summary artifact; this is not a complete BEPU campaign.</w:t>
-      </w:r>
-    </w:p>
-    <w:bookmarkEnd w:id="26"/>
-    <w:bookmarkEnd w:id="27"/>
-    <w:bookmarkStart w:id="31" w:name="results-and-figures-of-merit"/>
-    <w:p>
-      <w:pPr>
-        <w:pStyle w:val="Heading2"/>
-      </w:pPr>
-      <w:r>
-        <w:t xml:space="preserve">6. Results and Figures of Merit</w:t>
-      </w:r>
-    </w:p>
-    <w:bookmarkStart w:id="28" w:name="Xf77570bb5f55f062be41bd5bdddb35f2f9ec8ac"/>
-    <w:p>
-      <w:pPr>
-        <w:pStyle w:val="Heading3"/>
-      </w:pPr>
-      <w:r>
-        <w:t xml:space="preserve">6.1 Headline Plant Performance (</w:t>
+        <w:t xml:space="preserve">convergence-reason tracing and per-iteration diagnostics,</w:t>
+      </w:r>
+    </w:p>
+    <w:p>
+      <w:pPr>
+        <w:pStyle w:val="Compact"/>
+        <w:numPr>
+          <w:ilvl w:val="0"/>
+          <w:numId w:val="1002"/>
+        </w:numPr>
+      </w:pPr>
+      <w:r>
+        <w:t xml:space="preserve">canonical fail-fast gating when required-feasible conditions are violated.</w:t>
+      </w:r>
+    </w:p>
+    <w:p>
+      <w:pPr>
+        <w:pStyle w:val="FirstParagraph"/>
+      </w:pPr>
+      <w:r>
+        <w:t xml:space="preserve">Segmented heat-exchanger treatment and pinch constraints are retained. Feasibility constraints are evaluated within the solve loop, not as post-hoc filtering.</w:t>
+      </w:r>
+    </w:p>
+    <w:p>
+      <w:pPr>
+        <w:pStyle w:val="BodyText"/>
+      </w:pPr>
+      <w:r>
+        <w:t xml:space="preserve">Efficiency definitions used in this report:</w:t>
+      </w:r>
+    </w:p>
+    <w:p>
+      <w:pPr>
+        <w:pStyle w:val="Compact"/>
+        <w:numPr>
+          <w:ilvl w:val="0"/>
+          <w:numId w:val="1003"/>
+        </w:numPr>
+      </w:pPr>
+      <w:r>
+        <w:t xml:space="preserve">Thermal efficiency (</w:t>
       </w:r>
       <w:r>
         <w:rPr>
           <w:rStyle w:val="VerbatimChar"/>
         </w:rPr>
-        <w:t xml:space="preserve">S0_BASE_30MW_OPONLY</w:t>
-      </w:r>
-      <w:r>
-        <w:t xml:space="preserve">, operational-only)</w:t>
+        <w:t xml:space="preserve">eta_thermal</w:t>
+      </w:r>
+      <w:r>
+        <w:t xml:space="preserve">): cycle gross electrical power over cycle heat input basis (</w:t>
+      </w:r>
+      <w:r>
+        <w:rPr>
+          <w:rStyle w:val="VerbatimChar"/>
+        </w:rPr>
+        <w:t xml:space="preserve">Q_in</w:t>
+      </w:r>
+      <w:r>
+        <w:t xml:space="preserve"> </w:t>
+      </w:r>
+      <w:r>
+        <w:t xml:space="preserve">internal to cycle model).</w:t>
+      </w:r>
+    </w:p>
+    <w:p>
+      <w:pPr>
+        <w:pStyle w:val="Compact"/>
+        <w:numPr>
+          <w:ilvl w:val="0"/>
+          <w:numId w:val="1003"/>
+        </w:numPr>
+      </w:pPr>
+      <w:r>
+        <w:t xml:space="preserve">Net efficiency (</w:t>
+      </w:r>
+      <w:r>
+        <w:rPr>
+          <w:rStyle w:val="VerbatimChar"/>
+        </w:rPr>
+        <w:t xml:space="preserve">eta_net</w:t>
+      </w:r>
+      <w:r>
+        <w:t xml:space="preserve">): plant net electrical power over reactor thermal basis (</w:t>
+      </w:r>
+      <w:r>
+        <w:rPr>
+          <w:rStyle w:val="VerbatimChar"/>
+        </w:rPr>
+        <w:t xml:space="preserve">Q_thermal</w:t>
+      </w:r>
+      <w:r>
+        <w:t xml:space="preserve">).</w:t>
+      </w:r>
+    </w:p>
+    <w:bookmarkEnd w:id="19"/>
+    <w:bookmarkStart w:id="21" w:name="X121c24c2ba292f7895cbc1790da6c818e3fbf1e"/>
+    <w:p>
+      <w:pPr>
+        <w:pStyle w:val="Heading3"/>
+      </w:pPr>
+      <w:r>
+        <w:t xml:space="preserve">4.3 CO2 Accounting Method</w:t>
+      </w:r>
+    </w:p>
+    <w:bookmarkStart w:id="20" w:name="boundary-definition-box"/>
+    <w:p>
+      <w:pPr>
+        <w:pStyle w:val="Heading4"/>
+      </w:pPr>
+      <w:r>
+        <w:t xml:space="preserve">Boundary Definition Box</w:t>
+      </w:r>
+    </w:p>
+    <w:p>
+      <w:pPr>
+        <w:pStyle w:val="FirstParagraph"/>
+      </w:pPr>
+      <w:r>
+        <w:t xml:space="preserve">Headline boundary (used in main text):</w:t>
+      </w:r>
+    </w:p>
+    <w:p>
+      <w:pPr>
+        <w:pStyle w:val="BodyText"/>
+      </w:pPr>
+      <w:r>
+        <w:rPr>
+          <w:rStyle w:val="VerbatimChar"/>
+        </w:rPr>
+        <w:t xml:space="preserve">fuel_displacement: CO2_net = CO2_displaced_fossil + CO2_grid - CO2_embodied - CO2_reemitted_synthetic (if neutrality disabled)</w:t>
+      </w:r>
+    </w:p>
+    <w:p>
+      <w:pPr>
+        <w:pStyle w:val="BodyText"/>
+      </w:pPr>
+      <w:r>
+        <w:t xml:space="preserve">Sensitivity boundary (reported separately):</w:t>
+      </w:r>
+    </w:p>
+    <w:p>
+      <w:pPr>
+        <w:pStyle w:val="BodyText"/>
+      </w:pPr>
+      <w:r>
+        <w:rPr>
+          <w:rStyle w:val="VerbatimChar"/>
+        </w:rPr>
+        <w:t xml:space="preserve">operational_only: CO2_net = CO2_DAC + CO2_grid</w:t>
+      </w:r>
+    </w:p>
+    <w:p>
+      <w:pPr>
+        <w:pStyle w:val="BodyText"/>
+      </w:pPr>
+      <w:r>
+        <w:t xml:space="preserve">In the headline case, grid export is disabled and neutrality is enabled, so fuel-displacement net reduction is set by displaced-fossil and embodied-product terms under solved allocation constraints.</w:t>
+      </w:r>
+    </w:p>
+    <w:p>
+      <w:pPr>
+        <w:pStyle w:val="BodyText"/>
+      </w:pPr>
+      <w:r>
+        <w:t xml:space="preserve">Historical Jet-A equivalence assumptions are retained only for sensitivity framing and are not used to define the main headline FoM in this final draft.</w:t>
+      </w:r>
+    </w:p>
+    <w:bookmarkEnd w:id="20"/>
+    <w:bookmarkEnd w:id="21"/>
+    <w:bookmarkEnd w:id="22"/>
+    <w:bookmarkStart w:id="27" w:name="X5bd3d2df3c38a7ea5b9b5b309f3a245b5ade915"/>
+    <w:p>
+      <w:pPr>
+        <w:pStyle w:val="Heading2"/>
+      </w:pPr>
+      <w:r>
+        <w:t xml:space="preserve">5. Verification and Validation</w:t>
+      </w:r>
+    </w:p>
+    <w:bookmarkStart w:id="23" w:name="Xe4d7c3106815ea80c10a937f66c4dfc163036c2"/>
+    <w:p>
+      <w:pPr>
+        <w:pStyle w:val="Heading3"/>
+      </w:pPr>
+      <w:r>
+        <w:t xml:space="preserve">5.1 Verification (Implementation Correctness)</w:t>
+      </w:r>
+    </w:p>
+    <w:p>
+      <w:pPr>
+        <w:pStyle w:val="FirstParagraph"/>
+      </w:pPr>
+      <w:r>
+        <w:t xml:space="preserve">Verification evidence includes:</w:t>
+      </w:r>
+    </w:p>
+    <w:p>
+      <w:pPr>
+        <w:pStyle w:val="Compact"/>
+        <w:numPr>
+          <w:ilvl w:val="0"/>
+          <w:numId w:val="1004"/>
+        </w:numPr>
+      </w:pPr>
+      <w:r>
+        <w:t xml:space="preserve">unit-level and integration-level checks for new feasibility-recovery logic,</w:t>
+      </w:r>
+    </w:p>
+    <w:p>
+      <w:pPr>
+        <w:pStyle w:val="Compact"/>
+        <w:numPr>
+          <w:ilvl w:val="0"/>
+          <w:numId w:val="1004"/>
+        </w:numPr>
+      </w:pPr>
+      <w:r>
+        <w:t xml:space="preserve">deterministic search behavior tests,</w:t>
+      </w:r>
+    </w:p>
+    <w:p>
+      <w:pPr>
+        <w:pStyle w:val="Compact"/>
+        <w:numPr>
+          <w:ilvl w:val="0"/>
+          <w:numId w:val="1004"/>
+        </w:numPr>
+      </w:pPr>
+      <w:r>
+        <w:t xml:space="preserve">fail-fast/override control-flow tests,</w:t>
+      </w:r>
+    </w:p>
+    <w:p>
+      <w:pPr>
+        <w:pStyle w:val="Compact"/>
+        <w:numPr>
+          <w:ilvl w:val="0"/>
+          <w:numId w:val="1004"/>
+        </w:numPr>
+      </w:pPr>
+      <w:r>
+        <w:t xml:space="preserve">range-guard and metadata persistence checks,</w:t>
+      </w:r>
+    </w:p>
+    <w:p>
+      <w:pPr>
+        <w:pStyle w:val="Compact"/>
+        <w:numPr>
+          <w:ilvl w:val="0"/>
+          <w:numId w:val="1004"/>
+        </w:numPr>
+      </w:pPr>
+      <w:r>
+        <w:t xml:space="preserve">consistency checks for generated diagnostics serialization.</w:t>
+      </w:r>
+    </w:p>
+    <w:bookmarkEnd w:id="23"/>
+    <w:bookmarkStart w:id="24" w:name="X7bce202cae56067a07a7077b8dbce7ac2a6c1cd"/>
+    <w:p>
+      <w:pPr>
+        <w:pStyle w:val="Heading3"/>
+      </w:pPr>
+      <w:r>
+        <w:t xml:space="preserve">5.2 Validation (Model-to-Reference)</w:t>
+      </w:r>
+    </w:p>
+    <w:p>
+      <w:pPr>
+        <w:pStyle w:val="FirstParagraph"/>
+      </w:pPr>
+      <w:r>
+        <w:t xml:space="preserve">The cycle validation anchor is the Dostal-style case in the committed runner. Recent authoritative run output reports 41.07% thermal efficiency against an expected 45.0% ± 5.0% acceptance band, and this gate passes.</w:t>
+      </w:r>
+    </w:p>
+    <w:bookmarkEnd w:id="24"/>
+    <w:bookmarkStart w:id="25" w:name="X320ef5b1a23a990bc7ff237f55d490ebf6dd105"/>
+    <w:p>
+      <w:pPr>
+        <w:pStyle w:val="Heading3"/>
+      </w:pPr>
+      <w:r>
+        <w:t xml:space="preserve">5.3 Feasibility and Closure Evidence</w:t>
+      </w:r>
+    </w:p>
+    <w:p>
+      <w:pPr>
+        <w:pStyle w:val="FirstParagraph"/>
+      </w:pPr>
+      <w:r>
+        <w:t xml:space="preserve">For the headline baseline (</w:t>
+      </w:r>
+      <w:r>
+        <w:rPr>
+          <w:rStyle w:val="VerbatimChar"/>
+        </w:rPr>
+        <w:t xml:space="preserve">S2_30MW_FUELDISP</w:t>
+      </w:r>
+      <w:r>
+        <w:t xml:space="preserve">), all major gates pass:</w:t>
+      </w:r>
+    </w:p>
+    <w:p>
+      <w:pPr>
+        <w:pStyle w:val="Compact"/>
+        <w:numPr>
+          <w:ilvl w:val="0"/>
+          <w:numId w:val="1005"/>
+        </w:numPr>
+      </w:pPr>
+      <w:r>
+        <w:t xml:space="preserve">converged: true,</w:t>
+      </w:r>
+    </w:p>
+    <w:p>
+      <w:pPr>
+        <w:pStyle w:val="Compact"/>
+        <w:numPr>
+          <w:ilvl w:val="0"/>
+          <w:numId w:val="1005"/>
+        </w:numPr>
+      </w:pPr>
+      <w:r>
+        <w:t xml:space="preserve">feasible: true,</w:t>
+      </w:r>
+    </w:p>
+    <w:p>
+      <w:pPr>
+        <w:pStyle w:val="Compact"/>
+        <w:numPr>
+          <w:ilvl w:val="0"/>
+          <w:numId w:val="1005"/>
+        </w:numPr>
+      </w:pPr>
+      <w:r>
+        <w:t xml:space="preserve">plant energy closure: 0.435% (&lt;0.5% tolerance),</w:t>
+      </w:r>
+    </w:p>
+    <w:p>
+      <w:pPr>
+        <w:pStyle w:val="Compact"/>
+        <w:numPr>
+          <w:ilvl w:val="0"/>
+          <w:numId w:val="1005"/>
+        </w:numPr>
+      </w:pPr>
+      <w:r>
+        <w:t xml:space="preserve">positive pinch/supercritical margins,</w:t>
+      </w:r>
+    </w:p>
+    <w:p>
+      <w:pPr>
+        <w:pStyle w:val="Compact"/>
+        <w:numPr>
+          <w:ilvl w:val="0"/>
+          <w:numId w:val="1005"/>
+        </w:numPr>
+      </w:pPr>
+      <w:r>
+        <w:t xml:space="preserve">canonical scenarios S0-S3 all feasible and converged in final run.</w:t>
+      </w:r>
+    </w:p>
+    <w:bookmarkEnd w:id="25"/>
+    <w:bookmarkStart w:id="26" w:name="X47b33dbf897054d79ce3d759da46f0a1ef21be8"/>
+    <w:p>
+      <w:pPr>
+        <w:pStyle w:val="Heading3"/>
+      </w:pPr>
+      <w:r>
+        <w:t xml:space="preserve">5.4 Limitations</w:t>
+      </w:r>
+    </w:p>
+    <w:p>
+      <w:pPr>
+        <w:pStyle w:val="Compact"/>
+        <w:numPr>
+          <w:ilvl w:val="0"/>
+          <w:numId w:val="1006"/>
+        </w:numPr>
+      </w:pPr>
+      <w:r>
+        <w:t xml:space="preserve">Headline mode uses fixed-boundary cooling assumptions; fully coupled-cooler mode is retained as sensitivity and is currently infeasible in the tested baseline ambient condition.</w:t>
+      </w:r>
+    </w:p>
+    <w:p>
+      <w:pPr>
+        <w:pStyle w:val="Compact"/>
+        <w:numPr>
+          <w:ilvl w:val="0"/>
+          <w:numId w:val="1006"/>
+        </w:numPr>
+      </w:pPr>
+      <w:r>
+        <w:t xml:space="preserve">Core transient safety results in Section 7 are literature/external-workstream tagged where not branch-reproduced.</w:t>
+      </w:r>
+    </w:p>
+    <w:p>
+      <w:pPr>
+        <w:pStyle w:val="Compact"/>
+        <w:numPr>
+          <w:ilvl w:val="0"/>
+          <w:numId w:val="1006"/>
+        </w:numPr>
+      </w:pPr>
+      <w:r>
+        <w:t xml:space="preserve">Uncertainty characterization uses the committed UQ summary artifact; this is not a complete BEPU campaign.</w:t>
+      </w:r>
+    </w:p>
+    <w:bookmarkEnd w:id="26"/>
+    <w:bookmarkEnd w:id="27"/>
+    <w:bookmarkStart w:id="31" w:name="X41a7c9c0612acd423c844844a2233a43ccc591f"/>
+    <w:p>
+      <w:pPr>
+        <w:pStyle w:val="Heading2"/>
+      </w:pPr>
+      <w:r>
+        <w:t xml:space="preserve">6. Results and Figures of Merit</w:t>
+      </w:r>
+    </w:p>
+    <w:bookmarkStart w:id="28" w:name="Xd6e5f5a1803e448cc984d7e18cebe282903608e"/>
+    <w:p>
+      <w:pPr>
+        <w:pStyle w:val="Heading3"/>
+      </w:pPr>
+      <w:r>
+        <w:t xml:space="preserve">6.1 Headline Plant Performance (</w:t>
+      </w:r>
+      <w:r>
+        <w:rPr>
+          <w:rStyle w:val="VerbatimChar"/>
+        </w:rPr>
+        <w:t xml:space="preserve">S2_30MW_FUELDISP</w:t>
+      </w:r>
+      <w:r>
+        <w:t xml:space="preserve">, fuel_displacement)</w:t>
       </w:r>
     </w:p>
     <w:tbl>
@@ -1985,7 +2081,7 @@
       </w:tr>
     </w:tbl>
     <w:bookmarkEnd w:id="28"/>
-    <w:bookmarkStart w:id="29" w:name="primary-fom-single-headline-boundary"/>
+    <w:bookmarkStart w:id="29" w:name="Xf0f3e848046d3139d0bc1cd9308d3fbbfb56954"/>
     <w:p>
       <w:pPr>
         <w:pStyle w:val="Heading3"/>
@@ -1999,7 +2095,7 @@
         <w:pStyle w:val="FirstParagraph"/>
       </w:pPr>
       <w:r>
-        <w:t xml:space="preserve">Headline basis is strictly operational-only.</w:t>
+        <w:t xml:space="preserve">Headline basis is strictly fuel-displacement.</w:t>
       </w:r>
     </w:p>
     <w:tbl>
@@ -2060,7 +2156,7 @@
               <w:jc w:val="right"/>
             </w:pPr>
             <w:r>
-              <w:t xml:space="preserve">44,468 tCO2/year</w:t>
+              <w:t xml:space="preserve">9,898 tCO2/year</w:t>
             </w:r>
           </w:p>
         </w:tc>
@@ -2085,7 +2181,7 @@
               <w:jc w:val="right"/>
             </w:pPr>
             <w:r>
-              <w:t xml:space="preserve">1482.3 tCO2/MWth/year</w:t>
+              <w:t xml:space="preserve">329.9 tCO2/MWth/year</w:t>
             </w:r>
           </w:p>
         </w:tc>
@@ -2173,35 +2269,53 @@
       <w:r>
         <w:t xml:space="preserve">Uncertainty context (from committed UQ artifact, 120 samples):</w:t>
       </w:r>
-      <w:r>
-        <w:t xml:space="preserve"> </w:t>
-      </w:r>
-      <w:r>
-        <w:t xml:space="preserve">- FoM mean: 1474.0 tCO2/MWth/year</w:t>
-      </w:r>
-      <w:r>
-        <w:t xml:space="preserve"> </w:t>
-      </w:r>
-      <w:r>
-        <w:t xml:space="preserve">- p10/p50/p90: 1345.2 / 1473.2 / 1615.1</w:t>
-      </w:r>
-      <w:r>
-        <w:t xml:space="preserve"> </w:t>
-      </w:r>
-      <w:r>
-        <w:t xml:space="preserve">- 95% interval: 1273.7 to 1676.3</w:t>
-      </w:r>
-    </w:p>
-    <w:p>
-      <w:pPr>
-        <w:pStyle w:val="BodyText"/>
+    </w:p>
+    <w:p>
+      <w:pPr>
+        <w:pStyle w:val="Compact"/>
+        <w:numPr>
+          <w:ilvl w:val="0"/>
+          <w:numId w:val="1007"/>
+        </w:numPr>
+      </w:pPr>
+      <w:r>
+        <w:t xml:space="preserve">FoM mean: 331.6 tCO2/MWth/year</w:t>
+      </w:r>
+    </w:p>
+    <w:p>
+      <w:pPr>
+        <w:pStyle w:val="Compact"/>
+        <w:numPr>
+          <w:ilvl w:val="0"/>
+          <w:numId w:val="1007"/>
+        </w:numPr>
+      </w:pPr>
+      <w:r>
+        <w:t xml:space="preserve">p10/p50/p90: 302.7 / 331.5 / 360.8</w:t>
+      </w:r>
+    </w:p>
+    <w:p>
+      <w:pPr>
+        <w:pStyle w:val="Compact"/>
+        <w:numPr>
+          <w:ilvl w:val="0"/>
+          <w:numId w:val="1007"/>
+        </w:numPr>
+      </w:pPr>
+      <w:r>
+        <w:t xml:space="preserve">95% interval: 288.6 to 377.9</w:t>
+      </w:r>
+    </w:p>
+    <w:p>
+      <w:pPr>
+        <w:pStyle w:val="FirstParagraph"/>
       </w:pPr>
       <w:r>
         <w:t xml:space="preserve">This uncertainty reflects process-intensity perturbations around the locked baseline and should be read as model sensitivity context, not full technoeconomic project risk.</w:t>
       </w:r>
     </w:p>
     <w:bookmarkEnd w:id="29"/>
-    <w:bookmarkStart w:id="30" w:name="sensitivity-and-secondary-foms"/>
+    <w:bookmarkStart w:id="30" w:name="X6aa81e0593ab3e3fc43ef945bed5323e04be37b"/>
     <w:p>
       <w:pPr>
         <w:pStyle w:val="Heading3"/>
@@ -2221,16 +2335,15 @@
     <w:tbl>
       <w:tblPr>
         <w:tblStyle w:val="Table"/>
-        <w:tblW w:type="pct" w:w="5000"/>
-        <w:tblLayout w:type="fixed"/>
+        <w:tblW w:type="auto" w:w="0"/>
         <w:tblLook w:firstRow="1" w:lastRow="0" w:firstColumn="0" w:lastColumn="0" w:noHBand="0" w:noVBand="0" w:val="0020"/>
       </w:tblPr>
       <w:tblGrid>
-        <w:gridCol w:w="1397"/>
-        <w:gridCol w:w="1397"/>
-        <w:gridCol w:w="1863"/>
-        <w:gridCol w:w="1863"/>
-        <w:gridCol w:w="1397"/>
+        <w:gridCol w:w="1584"/>
+        <w:gridCol w:w="1584"/>
+        <w:gridCol w:w="1584"/>
+        <w:gridCol w:w="1584"/>
+        <w:gridCol w:w="1584"/>
       </w:tblGrid>
       <w:tr>
         <w:trPr>
@@ -2431,7 +2544,7 @@
               <w:pStyle w:val="Compact"/>
             </w:pPr>
             <w:r>
-              <w:t xml:space="preserve">30 MWth, fuel_displacement</w:t>
+              <w:t xml:space="preserve">30 MWth, fuel_displacement (headline)</w:t>
             </w:r>
           </w:p>
         </w:tc>
@@ -2538,28 +2651,46 @@
       <w:r>
         <w:t xml:space="preserve">Secondary indicators:</w:t>
       </w:r>
-      <w:r>
-        <w:t xml:space="preserve"> </w:t>
-      </w:r>
-      <w:r>
-        <w:t xml:space="preserve">- zero grid export in headline mode,</w:t>
-      </w:r>
-      <w:r>
-        <w:t xml:space="preserve"> </w:t>
-      </w:r>
-      <w:r>
-        <w:t xml:space="preserve">- dry-cooling auxiliary burden remains small relative to rejected heat,</w:t>
-      </w:r>
-      <w:r>
-        <w:t xml:space="preserve"> </w:t>
-      </w:r>
-      <w:r>
-        <w:t xml:space="preserve">- all headline feasibility margins non-negative.</w:t>
+    </w:p>
+    <w:p>
+      <w:pPr>
+        <w:pStyle w:val="Compact"/>
+        <w:numPr>
+          <w:ilvl w:val="0"/>
+          <w:numId w:val="1008"/>
+        </w:numPr>
+      </w:pPr>
+      <w:r>
+        <w:t xml:space="preserve">zero grid export in headline mode,</w:t>
+      </w:r>
+    </w:p>
+    <w:p>
+      <w:pPr>
+        <w:pStyle w:val="Compact"/>
+        <w:numPr>
+          <w:ilvl w:val="0"/>
+          <w:numId w:val="1008"/>
+        </w:numPr>
+      </w:pPr>
+      <w:r>
+        <w:t xml:space="preserve">dry-cooling auxiliary burden remains small relative to rejected heat,</w:t>
+      </w:r>
+    </w:p>
+    <w:p>
+      <w:pPr>
+        <w:pStyle w:val="Compact"/>
+        <w:numPr>
+          <w:ilvl w:val="0"/>
+          <w:numId w:val="1008"/>
+        </w:numPr>
+      </w:pPr>
+      <w:r>
+        <w:t xml:space="preserve">all headline feasibility margins non-negative.</w:t>
       </w:r>
     </w:p>
     <w:bookmarkEnd w:id="30"/>
     <w:bookmarkEnd w:id="31"/>
-    <w:bookmarkStart w:id="36" w:name="safety-philosophy"/>
+    <w:bookmarkStart w:id="36" w:name="X74d8d59f35cb602628ffd0cca29ca26331d9d46"/>
     <w:p>
       <w:pPr>
         <w:pStyle w:val="Heading2"/>
@@ -2568,7 +2699,7 @@
         <w:t xml:space="preserve">7. Safety Philosophy</w:t>
       </w:r>
     </w:p>
-    <w:bookmarkStart w:id="32" w:name="defence-in-depth"/>
+    <w:bookmarkStart w:id="32" w:name="X531c6d6fed1a09b1cdcf1f51bdb4e1866bcbe70"/>
     <w:p>
       <w:pPr>
         <w:pStyle w:val="Heading3"/>
@@ -2586,7 +2717,7 @@
       </w:r>
     </w:p>
     <w:bookmarkEnd w:id="32"/>
-    <w:bookmarkStart w:id="33" w:name="inherent-and-passive-features"/>
+    <w:bookmarkStart w:id="33" w:name="X7d62578fde42f47c3e9ca4ab11ce1adb61946cb"/>
     <w:p>
       <w:pPr>
         <w:pStyle w:val="Heading3"/>
@@ -2604,7 +2735,7 @@
       </w:r>
     </w:p>
     <w:bookmarkEnd w:id="33"/>
-    <w:bookmarkStart w:id="34" w:name="Xf307eedab461613c11a4e876ca03e0247b70d7e"/>
+    <w:bookmarkStart w:id="34" w:name="X2aaee77375a1b6cb93f98599187162fa1536ebd"/>
     <w:p>
       <w:pPr>
         <w:pStyle w:val="Heading3"/>
@@ -2620,11 +2751,17 @@
       <w:r>
         <w:t xml:space="preserve">Safety numbers are included with explicit provenance tags:</w:t>
       </w:r>
-      <w:r>
-        <w:t xml:space="preserve"> </w:t>
-      </w:r>
-      <w:r>
-        <w:t xml:space="preserve">- P-LOFC / D-LOFC peak-temperature values:</w:t>
+    </w:p>
+    <w:p>
+      <w:pPr>
+        <w:pStyle w:val="Compact"/>
+        <w:numPr>
+          <w:ilvl w:val="0"/>
+          <w:numId w:val="1009"/>
+        </w:numPr>
+      </w:pPr>
+      <w:r>
+        <w:t xml:space="preserve">P-LOFC / D-LOFC peak-temperature values:</w:t>
       </w:r>
       <w:r>
         <w:t xml:space="preserve"> </w:t>
@@ -2642,11 +2779,17 @@
       <w:r>
         <w:t xml:space="preserve">(not reproduced by this branch commit).</w:t>
       </w:r>
-      <w:r>
-        <w:t xml:space="preserve"> </w:t>
-      </w:r>
-      <w:r>
-        <w:t xml:space="preserve">- HTTR LOFC behavior references:</w:t>
+    </w:p>
+    <w:p>
+      <w:pPr>
+        <w:pStyle w:val="Compact"/>
+        <w:numPr>
+          <w:ilvl w:val="0"/>
+          <w:numId w:val="1009"/>
+        </w:numPr>
+      </w:pPr>
+      <w:r>
+        <w:t xml:space="preserve">HTTR LOFC behavior references:</w:t>
       </w:r>
       <w:r>
         <w:t xml:space="preserve"> </w:t>
@@ -2664,11 +2807,17 @@
       <w:r>
         <w:t xml:space="preserve">(JAEA/HTTR and related publications).</w:t>
       </w:r>
-      <w:r>
-        <w:t xml:space="preserve"> </w:t>
-      </w:r>
-      <w:r>
-        <w:t xml:space="preserve">- TRISO integrity thresholds and DiD framing:</w:t>
+    </w:p>
+    <w:p>
+      <w:pPr>
+        <w:pStyle w:val="Compact"/>
+        <w:numPr>
+          <w:ilvl w:val="0"/>
+          <w:numId w:val="1009"/>
+        </w:numPr>
+      </w:pPr>
+      <w:r>
+        <w:t xml:space="preserve">TRISO integrity thresholds and DiD framing:</w:t>
       </w:r>
       <w:r>
         <w:t xml:space="preserve"> </w:t>
@@ -2686,14 +2835,14 @@
     </w:p>
     <w:p>
       <w:pPr>
-        <w:pStyle w:val="BodyText"/>
+        <w:pStyle w:val="FirstParagraph"/>
       </w:pPr>
       <w:r>
         <w:t xml:space="preserve">Any number without branch reproducibility is intentionally labeled as literature/external evidence to prevent provenance ambiguity.</w:t>
       </w:r>
     </w:p>
     <w:bookmarkEnd w:id="34"/>
-    <w:bookmarkStart w:id="35" w:name="safety-limitations-and-next-step"/>
+    <w:bookmarkStart w:id="35" w:name="Xb4f8e0e1fd0c9adc78c4a82401bee7c2b1a5974"/>
     <w:p>
       <w:pPr>
         <w:pStyle w:val="Heading3"/>
@@ -2712,7 +2861,7 @@
     </w:p>
     <w:bookmarkEnd w:id="35"/>
     <w:bookmarkEnd w:id="36"/>
-    <w:bookmarkStart w:id="41" w:name="Xe404377c7cc5139b8e0e52ebcce7d62b9bd7cce"/>
+    <w:bookmarkStart w:id="41" w:name="X6ba26f4c47986d9fa32caaaec1120e3a018d7cb"/>
     <w:p>
       <w:pPr>
         <w:pStyle w:val="Heading2"/>
@@ -2721,7 +2870,7 @@
         <w:t xml:space="preserve">8. Challenges, Lessons Learned, and Team Structure</w:t>
       </w:r>
     </w:p>
-    <w:bookmarkStart w:id="37" w:name="professional-challenges"/>
+    <w:bookmarkStart w:id="37" w:name="Xb84e6b5eced3cf58990411c3f1ee29f49fb57f5"/>
     <w:p>
       <w:pPr>
         <w:pStyle w:val="Heading3"/>
@@ -2739,7 +2888,7 @@
       </w:r>
     </w:p>
     <w:bookmarkEnd w:id="37"/>
-    <w:bookmarkStart w:id="38" w:name="technical-challenges"/>
+    <w:bookmarkStart w:id="38" w:name="Xe29f0188cc6d720870b6c4b36a29200e2a85d38"/>
     <w:p>
       <w:pPr>
         <w:pStyle w:val="Heading3"/>
@@ -2757,7 +2906,7 @@
       </w:r>
     </w:p>
     <w:bookmarkEnd w:id="38"/>
-    <w:bookmarkStart w:id="39" w:name="lessons-learned"/>
+    <w:bookmarkStart w:id="39" w:name="X7037ef314f8cebf0e1338dbf905c480336eec7e"/>
     <w:p>
       <w:pPr>
         <w:pStyle w:val="Heading3"/>
@@ -2773,27 +2922,45 @@
       <w:r>
         <w:t xml:space="preserve">Three lessons were most important:</w:t>
       </w:r>
-      <w:r>
-        <w:t xml:space="preserve"> </w:t>
-      </w:r>
-      <w:r>
-        <w:t xml:space="preserve">1. feasibility-gated modelling is more decision-useful than unconstrained optimization,</w:t>
-      </w:r>
-      <w:r>
-        <w:t xml:space="preserve"> </w:t>
-      </w:r>
-      <w:r>
-        <w:t xml:space="preserve">2. boundary definitions must be explicit early to avoid reporting drift,</w:t>
-      </w:r>
-      <w:r>
-        <w:t xml:space="preserve"> </w:t>
-      </w:r>
-      <w:r>
-        <w:t xml:space="preserve">3. reproducibility artifacts (scenario-tagged outputs + diagnostics) are essential for credible engineering communication.</w:t>
+    </w:p>
+    <w:p>
+      <w:pPr>
+        <w:pStyle w:val="Compact"/>
+        <w:numPr>
+          <w:ilvl w:val="0"/>
+          <w:numId w:val="1010"/>
+        </w:numPr>
+      </w:pPr>
+      <w:r>
+        <w:t xml:space="preserve">feasibility-gated modelling is more decision-useful than unconstrained optimization,</w:t>
+      </w:r>
+    </w:p>
+    <w:p>
+      <w:pPr>
+        <w:pStyle w:val="Compact"/>
+        <w:numPr>
+          <w:ilvl w:val="0"/>
+          <w:numId w:val="1010"/>
+        </w:numPr>
+      </w:pPr>
+      <w:r>
+        <w:t xml:space="preserve">boundary definitions must be explicit early to avoid reporting drift,</w:t>
+      </w:r>
+    </w:p>
+    <w:p>
+      <w:pPr>
+        <w:pStyle w:val="Compact"/>
+        <w:numPr>
+          <w:ilvl w:val="0"/>
+          <w:numId w:val="1010"/>
+        </w:numPr>
+      </w:pPr>
+      <w:r>
+        <w:t xml:space="preserve">reproducibility artifacts (scenario-tagged outputs + diagnostics) are essential for credible engineering communication.</w:t>
       </w:r>
     </w:p>
     <w:bookmarkEnd w:id="39"/>
-    <w:bookmarkStart w:id="40" w:name="team-structure"/>
+    <w:bookmarkStart w:id="40" w:name="X1789f66bf3658f2f3ca0be508bcc536ec8e9b6a"/>
     <w:p>
       <w:pPr>
         <w:pStyle w:val="Heading3"/>
@@ -2812,7 +2979,7 @@
     </w:p>
     <w:bookmarkEnd w:id="40"/>
     <w:bookmarkEnd w:id="41"/>
-    <w:bookmarkStart w:id="45" w:name="novelty-and-future-work"/>
+    <w:bookmarkStart w:id="45" w:name="Xbe20b93a223c4904a55b4ccf94217aa3599b91e"/>
     <w:p>
       <w:pPr>
         <w:pStyle w:val="Heading2"/>
@@ -2821,7 +2988,7 @@
         <w:t xml:space="preserve">9. Novelty and Future Work</w:t>
       </w:r>
     </w:p>
-    <w:bookmarkStart w:id="42" w:name="novelty"/>
+    <w:bookmarkStart w:id="42" w:name="X1818d0149f924208d067b82018c15e117d569a0"/>
     <w:p>
       <w:pPr>
         <w:pStyle w:val="Heading3"/>
@@ -2835,11 +3002,11 @@
         <w:pStyle w:val="FirstParagraph"/>
       </w:pPr>
       <w:r>
-        <w:t xml:space="preserve">The key novelty is system-level heat-quality integration: waste-heat utilization is treated as a design resource rather than solely a rejection burden. Combined with operational-only carbon accounting and feasibility-gated optimization, this yields a defensible baseline FoM under explicit constraints.</w:t>
+        <w:t xml:space="preserve">The key novelty is system-level heat-quality integration: waste-heat utilization is treated as a design resource rather than solely a rejection burden. Combined with explicitly labeled fuel-displacement accounting and feasibility-gated optimization, this yields a defensible baseline FoM under explicit constraints.</w:t>
       </w:r>
     </w:p>
     <w:bookmarkEnd w:id="42"/>
-    <w:bookmarkStart w:id="43" w:name="historical-context"/>
+    <w:bookmarkStart w:id="43" w:name="X5dcf6b3e2c3aa99b384333ae961f025883ded74"/>
     <w:p>
       <w:pPr>
         <w:pStyle w:val="Heading3"/>
@@ -2857,7 +3024,7 @@
       </w:r>
     </w:p>
     <w:bookmarkEnd w:id="43"/>
-    <w:bookmarkStart w:id="44" w:name="future-work"/>
+    <w:bookmarkStart w:id="44" w:name="Xa499a6c32b1271d9483dd8fd6b761178f918ec1"/>
     <w:p>
       <w:pPr>
         <w:pStyle w:val="Heading3"/>
@@ -2873,29 +3040,53 @@
       <w:r>
         <w:t xml:space="preserve">Priority next steps:</w:t>
       </w:r>
-      <w:r>
-        <w:t xml:space="preserve"> </w:t>
-      </w:r>
-      <w:r>
-        <w:t xml:space="preserve">1. branch-reproducible safety transient model integration,</w:t>
-      </w:r>
-      <w:r>
-        <w:t xml:space="preserve"> </w:t>
-      </w:r>
-      <w:r>
-        <w:t xml:space="preserve">2. coupled-cooler sensitivity stabilization,</w:t>
-      </w:r>
-      <w:r>
-        <w:t xml:space="preserve"> </w:t>
-      </w:r>
-      <w:r>
-        <w:t xml:space="preserve">3. expanded uncertainty campaign (true BEPU-style optimistic/realistic/pessimistic envelopes),</w:t>
-      </w:r>
-      <w:r>
-        <w:t xml:space="preserve"> </w:t>
-      </w:r>
-      <w:r>
-        <w:t xml:space="preserve">4. higher-fidelity heat-rejection and off-design ambient analyses.</w:t>
+    </w:p>
+    <w:p>
+      <w:pPr>
+        <w:pStyle w:val="Compact"/>
+        <w:numPr>
+          <w:ilvl w:val="0"/>
+          <w:numId w:val="1011"/>
+        </w:numPr>
+      </w:pPr>
+      <w:r>
+        <w:t xml:space="preserve">branch-reproducible safety transient model integration,</w:t>
+      </w:r>
+    </w:p>
+    <w:p>
+      <w:pPr>
+        <w:pStyle w:val="Compact"/>
+        <w:numPr>
+          <w:ilvl w:val="0"/>
+          <w:numId w:val="1011"/>
+        </w:numPr>
+      </w:pPr>
+      <w:r>
+        <w:t xml:space="preserve">coupled-cooler sensitivity stabilization,</w:t>
+      </w:r>
+    </w:p>
+    <w:p>
+      <w:pPr>
+        <w:pStyle w:val="Compact"/>
+        <w:numPr>
+          <w:ilvl w:val="0"/>
+          <w:numId w:val="1011"/>
+        </w:numPr>
+      </w:pPr>
+      <w:r>
+        <w:t xml:space="preserve">expanded uncertainty campaign (true BEPU-style optimistic/realistic/pessimistic envelopes),</w:t>
+      </w:r>
+    </w:p>
+    <w:p>
+      <w:pPr>
+        <w:pStyle w:val="Compact"/>
+        <w:numPr>
+          <w:ilvl w:val="0"/>
+          <w:numId w:val="1011"/>
+        </w:numPr>
+      </w:pPr>
+      <w:r>
+        <w:t xml:space="preserve">higher-fidelity heat-rejection and off-design ambient analyses.</w:t>
       </w:r>
     </w:p>
     <w:bookmarkEnd w:id="44"/>
@@ -2914,11 +3105,11 @@
         <w:pStyle w:val="Compact"/>
         <w:numPr>
           <w:ilvl w:val="0"/>
-          <w:numId w:val="1003"/>
+          <w:numId w:val="1012"/>
         </w:numPr>
       </w:pPr>
       <w:r>
-        <w:t xml:space="preserve">Dostal et al. (2004), MIT-ANP-TR-100.</w:t>
+        <w:t xml:space="preserve">Dostal et al. (2004), MIT-ANP-TR-100.</w:t>
       </w:r>
     </w:p>
     <w:p>
@@ -2926,7 +3117,7 @@
         <w:pStyle w:val="Compact"/>
         <w:numPr>
           <w:ilvl w:val="0"/>
-          <w:numId w:val="1003"/>
+          <w:numId w:val="1012"/>
         </w:numPr>
       </w:pPr>
       <w:r>
@@ -2938,7 +3129,7 @@
         <w:pStyle w:val="Compact"/>
         <w:numPr>
           <w:ilvl w:val="0"/>
-          <w:numId w:val="1003"/>
+          <w:numId w:val="1012"/>
         </w:numPr>
       </w:pPr>
       <w:r>
@@ -2950,7 +3141,7 @@
         <w:pStyle w:val="Compact"/>
         <w:numPr>
           <w:ilvl w:val="0"/>
-          <w:numId w:val="1003"/>
+          <w:numId w:val="1012"/>
         </w:numPr>
       </w:pPr>
       <w:r>
@@ -2962,7 +3153,7 @@
         <w:pStyle w:val="Compact"/>
         <w:numPr>
           <w:ilvl w:val="0"/>
-          <w:numId w:val="1003"/>
+          <w:numId w:val="1012"/>
         </w:numPr>
       </w:pPr>
       <w:r>
@@ -2984,7 +3175,7 @@
         <w:pStyle w:val="Compact"/>
         <w:numPr>
           <w:ilvl w:val="0"/>
-          <w:numId w:val="1004"/>
+          <w:numId w:val="1013"/>
         </w:numPr>
       </w:pPr>
       <w:r>
@@ -2999,7 +3190,7 @@
         <w:pStyle w:val="Compact"/>
         <w:numPr>
           <w:ilvl w:val="0"/>
-          <w:numId w:val="1004"/>
+          <w:numId w:val="1013"/>
         </w:numPr>
       </w:pPr>
       <w:r>
@@ -3014,7 +3205,7 @@
         <w:pStyle w:val="Compact"/>
         <w:numPr>
           <w:ilvl w:val="0"/>
-          <w:numId w:val="1004"/>
+          <w:numId w:val="1013"/>
         </w:numPr>
       </w:pPr>
       <w:r>
@@ -3029,7 +3220,7 @@
         <w:pStyle w:val="Compact"/>
         <w:numPr>
           <w:ilvl w:val="0"/>
-          <w:numId w:val="1004"/>
+          <w:numId w:val="1013"/>
         </w:numPr>
       </w:pPr>
       <w:r>
@@ -3044,7 +3235,7 @@
         <w:pStyle w:val="Compact"/>
         <w:numPr>
           <w:ilvl w:val="0"/>
-          <w:numId w:val="1004"/>
+          <w:numId w:val="1013"/>
         </w:numPr>
       </w:pPr>
       <w:r>
@@ -3396,6 +3587,87 @@
   <w:num w:numId="1004">
     <w:abstractNumId w:val="991"/>
   </w:num>
+  <w:num w:numId="1005">
+    <w:abstractNumId w:val="991"/>
+  </w:num>
+  <w:num w:numId="1006">
+    <w:abstractNumId w:val="991"/>
+  </w:num>
+  <w:num w:numId="1007">
+    <w:abstractNumId w:val="991"/>
+  </w:num>
+  <w:num w:numId="1008">
+    <w:abstractNumId w:val="991"/>
+  </w:num>
+  <w:num w:numId="1009">
+    <w:abstractNumId w:val="991"/>
+  </w:num>
+  <w:num w:numId="1010">
+    <w:abstractNumId w:val="99411"/>
+    <w:lvlOverride w:ilvl="0">
+      <w:startOverride w:val="1"/>
+    </w:lvlOverride>
+    <w:lvlOverride w:ilvl="1">
+      <w:startOverride w:val="1"/>
+    </w:lvlOverride>
+    <w:lvlOverride w:ilvl="2">
+      <w:startOverride w:val="1"/>
+    </w:lvlOverride>
+    <w:lvlOverride w:ilvl="3">
+      <w:startOverride w:val="1"/>
+    </w:lvlOverride>
+    <w:lvlOverride w:ilvl="4">
+      <w:startOverride w:val="1"/>
+    </w:lvlOverride>
+    <w:lvlOverride w:ilvl="5">
+      <w:startOverride w:val="1"/>
+    </w:lvlOverride>
+    <w:lvlOverride w:ilvl="6">
+      <w:startOverride w:val="1"/>
+    </w:lvlOverride>
+    <w:lvlOverride w:ilvl="7">
+      <w:startOverride w:val="1"/>
+    </w:lvlOverride>
+    <w:lvlOverride w:ilvl="8">
+      <w:startOverride w:val="1"/>
+    </w:lvlOverride>
+  </w:num>
+  <w:num w:numId="1011">
+    <w:abstractNumId w:val="99411"/>
+    <w:lvlOverride w:ilvl="0">
+      <w:startOverride w:val="1"/>
+    </w:lvlOverride>
+    <w:lvlOverride w:ilvl="1">
+      <w:startOverride w:val="1"/>
+    </w:lvlOverride>
+    <w:lvlOverride w:ilvl="2">
+      <w:startOverride w:val="1"/>
+    </w:lvlOverride>
+    <w:lvlOverride w:ilvl="3">
+      <w:startOverride w:val="1"/>
+    </w:lvlOverride>
+    <w:lvlOverride w:ilvl="4">
+      <w:startOverride w:val="1"/>
+    </w:lvlOverride>
+    <w:lvlOverride w:ilvl="5">
+      <w:startOverride w:val="1"/>
+    </w:lvlOverride>
+    <w:lvlOverride w:ilvl="6">
+      <w:startOverride w:val="1"/>
+    </w:lvlOverride>
+    <w:lvlOverride w:ilvl="7">
+      <w:startOverride w:val="1"/>
+    </w:lvlOverride>
+    <w:lvlOverride w:ilvl="8">
+      <w:startOverride w:val="1"/>
+    </w:lvlOverride>
+  </w:num>
+  <w:num w:numId="1012">
+    <w:abstractNumId w:val="991"/>
+  </w:num>
+  <w:num w:numId="1013">
+    <w:abstractNumId w:val="991"/>
+  </w:num>
 </w:numbering>
 </file>
 
@@ -4055,7 +4327,7 @@
       <w:color w:themeColor="accent1" w:themeShade="BF" w:val="365F91"/>
     </w:rPr>
   </w:style>
-  <w:style w:type="paragraph" w:customStyle="1" w:styleId="SourceCode">
+  <w:style w:customStyle="1" w:styleId="SourceCode" w:type="paragraph">
     <w:name w:val="Source Code"/>
     <w:basedOn w:val="Normal"/>
     <w:link w:val="VerbatimChar"/>
@@ -4063,7 +4335,7 @@
       <w:wordWrap w:val="off"/>
     </w:pPr>
   </w:style>
-  <w:style w:type="character" w:customStyle="1" w:styleId="KeywordTok">
+  <w:style w:customStyle="1" w:styleId="KeywordTok" w:type="character">
     <w:name w:val="KeywordTok"/>
     <w:basedOn w:val="VerbatimChar"/>
     <w:rPr>
@@ -4071,77 +4343,77 @@
       <w:color w:val="007020"/>
     </w:rPr>
   </w:style>
-  <w:style w:type="character" w:customStyle="1" w:styleId="DataTypeTok">
+  <w:style w:customStyle="1" w:styleId="DataTypeTok" w:type="character">
     <w:name w:val="DataTypeTok"/>
     <w:basedOn w:val="VerbatimChar"/>
     <w:rPr>
       <w:color w:val="902000"/>
     </w:rPr>
   </w:style>
-  <w:style w:type="character" w:customStyle="1" w:styleId="DecValTok">
+  <w:style w:customStyle="1" w:styleId="DecValTok" w:type="character">
     <w:name w:val="DecValTok"/>
     <w:basedOn w:val="VerbatimChar"/>
     <w:rPr>
       <w:color w:val="40a070"/>
     </w:rPr>
   </w:style>
-  <w:style w:type="character" w:customStyle="1" w:styleId="BaseNTok">
+  <w:style w:customStyle="1" w:styleId="BaseNTok" w:type="character">
     <w:name w:val="BaseNTok"/>
     <w:basedOn w:val="VerbatimChar"/>
     <w:rPr>
       <w:color w:val="40a070"/>
     </w:rPr>
   </w:style>
-  <w:style w:type="character" w:customStyle="1" w:styleId="FloatTok">
+  <w:style w:customStyle="1" w:styleId="FloatTok" w:type="character">
     <w:name w:val="FloatTok"/>
     <w:basedOn w:val="VerbatimChar"/>
     <w:rPr>
       <w:color w:val="40a070"/>
     </w:rPr>
   </w:style>
-  <w:style w:type="character" w:customStyle="1" w:styleId="ConstantTok">
+  <w:style w:customStyle="1" w:styleId="ConstantTok" w:type="character">
     <w:name w:val="ConstantTok"/>
     <w:basedOn w:val="VerbatimChar"/>
     <w:rPr>
       <w:color w:val="880000"/>
     </w:rPr>
   </w:style>
-  <w:style w:type="character" w:customStyle="1" w:styleId="CharTok">
+  <w:style w:customStyle="1" w:styleId="CharTok" w:type="character">
     <w:name w:val="CharTok"/>
     <w:basedOn w:val="VerbatimChar"/>
     <w:rPr>
       <w:color w:val="4070a0"/>
     </w:rPr>
   </w:style>
-  <w:style w:type="character" w:customStyle="1" w:styleId="SpecialCharTok">
+  <w:style w:customStyle="1" w:styleId="SpecialCharTok" w:type="character">
     <w:name w:val="SpecialCharTok"/>
     <w:basedOn w:val="VerbatimChar"/>
     <w:rPr>
       <w:color w:val="4070a0"/>
     </w:rPr>
   </w:style>
-  <w:style w:type="character" w:customStyle="1" w:styleId="StringTok">
+  <w:style w:customStyle="1" w:styleId="StringTok" w:type="character">
     <w:name w:val="StringTok"/>
     <w:basedOn w:val="VerbatimChar"/>
     <w:rPr>
       <w:color w:val="4070a0"/>
     </w:rPr>
   </w:style>
-  <w:style w:type="character" w:customStyle="1" w:styleId="VerbatimStringTok">
+  <w:style w:customStyle="1" w:styleId="VerbatimStringTok" w:type="character">
     <w:name w:val="VerbatimStringTok"/>
     <w:basedOn w:val="VerbatimChar"/>
     <w:rPr>
       <w:color w:val="4070a0"/>
     </w:rPr>
   </w:style>
-  <w:style w:type="character" w:customStyle="1" w:styleId="SpecialStringTok">
+  <w:style w:customStyle="1" w:styleId="SpecialStringTok" w:type="character">
     <w:name w:val="SpecialStringTok"/>
     <w:basedOn w:val="VerbatimChar"/>
     <w:rPr>
       <w:color w:val="bb6688"/>
     </w:rPr>
   </w:style>
-  <w:style w:type="character" w:customStyle="1" w:styleId="ImportTok">
+  <w:style w:customStyle="1" w:styleId="ImportTok" w:type="character">
     <w:name w:val="ImportTok"/>
     <w:basedOn w:val="VerbatimChar"/>
     <w:rPr>
@@ -4149,7 +4421,7 @@
       <w:color w:val="008000"/>
     </w:rPr>
   </w:style>
-  <w:style w:type="character" w:customStyle="1" w:styleId="CommentTok">
+  <w:style w:customStyle="1" w:styleId="CommentTok" w:type="character">
     <w:name w:val="CommentTok"/>
     <w:basedOn w:val="VerbatimChar"/>
     <w:rPr>
@@ -4157,7 +4429,7 @@
       <w:color w:val="60a0b0"/>
     </w:rPr>
   </w:style>
-  <w:style w:type="character" w:customStyle="1" w:styleId="DocumentationTok">
+  <w:style w:customStyle="1" w:styleId="DocumentationTok" w:type="character">
     <w:name w:val="DocumentationTok"/>
     <w:basedOn w:val="VerbatimChar"/>
     <w:rPr>
@@ -4165,7 +4437,7 @@
       <w:color w:val="ba2121"/>
     </w:rPr>
   </w:style>
-  <w:style w:type="character" w:customStyle="1" w:styleId="AnnotationTok">
+  <w:style w:customStyle="1" w:styleId="AnnotationTok" w:type="character">
     <w:name w:val="AnnotationTok"/>
     <w:basedOn w:val="VerbatimChar"/>
     <w:rPr>
@@ -4174,7 +4446,7 @@
       <w:color w:val="60a0b0"/>
     </w:rPr>
   </w:style>
-  <w:style w:type="character" w:customStyle="1" w:styleId="CommentVarTok">
+  <w:style w:customStyle="1" w:styleId="CommentVarTok" w:type="character">
     <w:name w:val="CommentVarTok"/>
     <w:basedOn w:val="VerbatimChar"/>
     <w:rPr>
@@ -4183,28 +4455,28 @@
       <w:color w:val="60a0b0"/>
     </w:rPr>
   </w:style>
-  <w:style w:type="character" w:customStyle="1" w:styleId="OtherTok">
+  <w:style w:customStyle="1" w:styleId="OtherTok" w:type="character">
     <w:name w:val="OtherTok"/>
     <w:basedOn w:val="VerbatimChar"/>
     <w:rPr>
       <w:color w:val="007020"/>
     </w:rPr>
   </w:style>
-  <w:style w:type="character" w:customStyle="1" w:styleId="FunctionTok">
+  <w:style w:customStyle="1" w:styleId="FunctionTok" w:type="character">
     <w:name w:val="FunctionTok"/>
     <w:basedOn w:val="VerbatimChar"/>
     <w:rPr>
       <w:color w:val="06287e"/>
     </w:rPr>
   </w:style>
-  <w:style w:type="character" w:customStyle="1" w:styleId="VariableTok">
+  <w:style w:customStyle="1" w:styleId="VariableTok" w:type="character">
     <w:name w:val="VariableTok"/>
     <w:basedOn w:val="VerbatimChar"/>
     <w:rPr>
       <w:color w:val="19177c"/>
     </w:rPr>
   </w:style>
-  <w:style w:type="character" w:customStyle="1" w:styleId="ControlFlowTok">
+  <w:style w:customStyle="1" w:styleId="ControlFlowTok" w:type="character">
     <w:name w:val="ControlFlowTok"/>
     <w:basedOn w:val="VerbatimChar"/>
     <w:rPr>
@@ -4212,45 +4484,45 @@
       <w:color w:val="007020"/>
     </w:rPr>
   </w:style>
-  <w:style w:type="character" w:customStyle="1" w:styleId="OperatorTok">
+  <w:style w:customStyle="1" w:styleId="OperatorTok" w:type="character">
     <w:name w:val="OperatorTok"/>
     <w:basedOn w:val="VerbatimChar"/>
     <w:rPr>
       <w:color w:val="666666"/>
     </w:rPr>
   </w:style>
-  <w:style w:type="character" w:customStyle="1" w:styleId="BuiltInTok">
+  <w:style w:customStyle="1" w:styleId="BuiltInTok" w:type="character">
     <w:name w:val="BuiltInTok"/>
     <w:basedOn w:val="VerbatimChar"/>
     <w:rPr>
       <w:color w:val="008000"/>
     </w:rPr>
   </w:style>
-  <w:style w:type="character" w:customStyle="1" w:styleId="ExtensionTok">
+  <w:style w:customStyle="1" w:styleId="ExtensionTok" w:type="character">
     <w:name w:val="ExtensionTok"/>
     <w:basedOn w:val="VerbatimChar"/>
     <w:rPr/>
   </w:style>
-  <w:style w:type="character" w:customStyle="1" w:styleId="PreprocessorTok">
+  <w:style w:customStyle="1" w:styleId="PreprocessorTok" w:type="character">
     <w:name w:val="PreprocessorTok"/>
     <w:basedOn w:val="VerbatimChar"/>
     <w:rPr>
       <w:color w:val="bc7a00"/>
     </w:rPr>
   </w:style>
-  <w:style w:type="character" w:customStyle="1" w:styleId="AttributeTok">
+  <w:style w:customStyle="1" w:styleId="AttributeTok" w:type="character">
     <w:name w:val="AttributeTok"/>
     <w:basedOn w:val="VerbatimChar"/>
     <w:rPr>
       <w:color w:val="7d9029"/>
     </w:rPr>
   </w:style>
-  <w:style w:type="character" w:customStyle="1" w:styleId="RegionMarkerTok">
+  <w:style w:customStyle="1" w:styleId="RegionMarkerTok" w:type="character">
     <w:name w:val="RegionMarkerTok"/>
     <w:basedOn w:val="VerbatimChar"/>
     <w:rPr/>
   </w:style>
-  <w:style w:type="character" w:customStyle="1" w:styleId="InformationTok">
+  <w:style w:customStyle="1" w:styleId="InformationTok" w:type="character">
     <w:name w:val="InformationTok"/>
     <w:basedOn w:val="VerbatimChar"/>
     <w:rPr>
@@ -4259,7 +4531,7 @@
       <w:color w:val="60a0b0"/>
     </w:rPr>
   </w:style>
-  <w:style w:type="character" w:customStyle="1" w:styleId="WarningTok">
+  <w:style w:customStyle="1" w:styleId="WarningTok" w:type="character">
     <w:name w:val="WarningTok"/>
     <w:basedOn w:val="VerbatimChar"/>
     <w:rPr>
@@ -4268,7 +4540,7 @@
       <w:color w:val="60a0b0"/>
     </w:rPr>
   </w:style>
-  <w:style w:type="character" w:customStyle="1" w:styleId="AlertTok">
+  <w:style w:customStyle="1" w:styleId="AlertTok" w:type="character">
     <w:name w:val="AlertTok"/>
     <w:basedOn w:val="VerbatimChar"/>
     <w:rPr>
@@ -4276,7 +4548,7 @@
       <w:color w:val="ff0000"/>
     </w:rPr>
   </w:style>
-  <w:style w:type="character" w:customStyle="1" w:styleId="ErrorTok">
+  <w:style w:customStyle="1" w:styleId="ErrorTok" w:type="character">
     <w:name w:val="ErrorTok"/>
     <w:basedOn w:val="VerbatimChar"/>
     <w:rPr>
@@ -4284,7 +4556,7 @@
       <w:color w:val="ff0000"/>
     </w:rPr>
   </w:style>
-  <w:style w:type="character" w:customStyle="1" w:styleId="NormalTok">
+  <w:style w:customStyle="1" w:styleId="NormalTok" w:type="character">
     <w:name w:val="NormalTok"/>
     <w:basedOn w:val="VerbatimChar"/>
     <w:rPr/>

</xml_diff>